<commit_message>
BJD converters use local microservice only.
</commit_message>
<xml_diff>
--- a/plugin/doc/BJD_TDB Converter.docx
+++ b/plugin/doc/BJD_TDB Converter.docx
@@ -59,32 +59,20 @@
     </w:p>
     <w:p>
       <w:r>
-        <w:t>By default, the time-conversion service provided by The Ohio State University is used</w:t>
-      </w:r>
-      <w:r>
-        <w:t xml:space="preserve"> </w:t>
-      </w:r>
-      <w:r>
-        <w:t>(</w:t>
-      </w:r>
-      <w:hyperlink r:id="rId7">
-        <w:r>
-          <w:rPr>
-            <w:rStyle w:val="ae"/>
-          </w:rPr>
-          <w:t>https://astroutils.astronomy.osu.edu/time/</w:t>
-        </w:r>
-      </w:hyperlink>
-      <w:r>
-        <w:t xml:space="preserve">). </w:t>
-      </w:r>
-      <w:r>
-        <w:t>If the service is unavailable (e.g., due to maintenance), the plug-in can fall back on a local Python (Flask) microservice, which must be explicitly configured and activated by the user (see Appendix).</w:t>
-      </w:r>
-    </w:p>
-    <w:p>
-      <w:r>
-        <w:t xml:space="preserve">To install the </w:t>
+        <w:t xml:space="preserve">The plug-in uses a local Python-based microservice. Please see the Appendix for information on how to install and configure </w:t>
+      </w:r>
+      <w:proofErr w:type="spellStart"/>
+      <w:proofErr w:type="gramStart"/>
+      <w:r>
+        <w:t>it.</w:t>
+      </w:r>
+      <w:r>
+        <w:t>To</w:t>
+      </w:r>
+      <w:proofErr w:type="spellEnd"/>
+      <w:proofErr w:type="gramEnd"/>
+      <w:r>
+        <w:t xml:space="preserve"> install the </w:t>
       </w:r>
       <w:r>
         <w:rPr>
@@ -104,7 +92,15 @@
         <w:t>Tools</w:t>
       </w:r>
       <w:r>
-        <w:t xml:space="preserve"> menu in VStar and select </w:t>
+        <w:t xml:space="preserve"> menu in </w:t>
+      </w:r>
+      <w:proofErr w:type="spellStart"/>
+      <w:r>
+        <w:t>VStar</w:t>
+      </w:r>
+      <w:proofErr w:type="spellEnd"/>
+      <w:r>
+        <w:t xml:space="preserve"> and select </w:t>
       </w:r>
       <w:r>
         <w:rPr>
@@ -134,7 +130,15 @@
         <w:t>Install</w:t>
       </w:r>
       <w:r>
-        <w:t xml:space="preserve"> button. After installation, restart VStar.</w:t>
+        <w:t xml:space="preserve"> button. After installation, restart </w:t>
+      </w:r>
+      <w:proofErr w:type="spellStart"/>
+      <w:r>
+        <w:t>VStar</w:t>
+      </w:r>
+      <w:proofErr w:type="spellEnd"/>
+      <w:r>
+        <w:t>.</w:t>
       </w:r>
     </w:p>
     <w:p>
@@ -211,7 +215,7 @@
                     <pic:cNvPicPr/>
                   </pic:nvPicPr>
                   <pic:blipFill>
-                    <a:blip r:embed="rId8">
+                    <a:blip r:embed="rId7">
                       <a:extLst>
                         <a:ext uri="{28A0092B-C50C-407E-A947-70E740481C1C}">
                           <a14:useLocalDpi xmlns:a14="http://schemas.microsoft.com/office/drawing/2010/main" val="0"/>
@@ -250,13 +254,7 @@
         <w:t>View</w:t>
       </w:r>
       <w:r>
-        <w:t xml:space="preserve"> </w:t>
-      </w:r>
-      <w:r>
-        <w:t>-&gt;</w:t>
-      </w:r>
-      <w:r>
-        <w:t xml:space="preserve"> </w:t>
+        <w:t xml:space="preserve"> -&gt; </w:t>
       </w:r>
       <w:r>
         <w:rPr>
@@ -297,7 +295,7 @@
                     <pic:cNvPicPr/>
                   </pic:nvPicPr>
                   <pic:blipFill>
-                    <a:blip r:embed="rId9">
+                    <a:blip r:embed="rId8">
                       <a:extLst>
                         <a:ext uri="{28A0092B-C50C-407E-A947-70E740481C1C}">
                           <a14:useLocalDpi xmlns:a14="http://schemas.microsoft.com/office/drawing/2010/main" val="0"/>
@@ -388,7 +386,7 @@
                     <pic:cNvPicPr/>
                   </pic:nvPicPr>
                   <pic:blipFill>
-                    <a:blip r:embed="rId10">
+                    <a:blip r:embed="rId9">
                       <a:extLst>
                         <a:ext uri="{28A0092B-C50C-407E-A947-70E740481C1C}">
                           <a14:useLocalDpi xmlns:a14="http://schemas.microsoft.com/office/drawing/2010/main" val="0"/>
@@ -417,10 +415,7 @@
     </w:p>
     <w:p>
       <w:r>
-        <w:t>Click OK. After a brief delay, an information dialog will appear</w:t>
-      </w:r>
-      <w:r>
-        <w:t>:</w:t>
+        <w:t>Click OK. After a brief delay, an information dialog will appear:</w:t>
       </w:r>
     </w:p>
     <w:p>
@@ -447,7 +442,7 @@
                     <pic:cNvPicPr/>
                   </pic:nvPicPr>
                   <pic:blipFill>
-                    <a:blip r:embed="rId11">
+                    <a:blip r:embed="rId10">
                       <a:extLst>
                         <a:ext uri="{28A0092B-C50C-407E-A947-70E740481C1C}">
                           <a14:useLocalDpi xmlns:a14="http://schemas.microsoft.com/office/drawing/2010/main" val="0"/>
@@ -489,7 +484,15 @@
         <w:t xml:space="preserve">again. </w:t>
       </w:r>
       <w:r>
-        <w:t>You should see that the observations are now in the BJD</w:t>
+        <w:t xml:space="preserve">You should see that the observations are now </w:t>
+      </w:r>
+      <w:proofErr w:type="gramStart"/>
+      <w:r>
+        <w:t>in</w:t>
+      </w:r>
+      <w:proofErr w:type="gramEnd"/>
+      <w:r>
+        <w:t xml:space="preserve"> the BJD</w:t>
       </w:r>
       <w:r>
         <w:rPr>
@@ -529,7 +532,7 @@
                     <pic:cNvPicPr/>
                   </pic:nvPicPr>
                   <pic:blipFill>
-                    <a:blip r:embed="rId12">
+                    <a:blip r:embed="rId11">
                       <a:extLst>
                         <a:ext uri="{28A0092B-C50C-407E-A947-70E740481C1C}">
                           <a14:useLocalDpi xmlns:a14="http://schemas.microsoft.com/office/drawing/2010/main" val="0"/>
@@ -559,10 +562,21 @@
     <w:p/>
     <w:p>
       <w:pPr>
-        <w:pStyle w:val="2"/>
-      </w:pPr>
-      <w:r>
-        <w:t>Appendix. Using the local microservice</w:t>
+        <w:rPr>
+          <w:rFonts w:asciiTheme="majorHAnsi" w:eastAsiaTheme="majorEastAsia" w:hAnsiTheme="majorHAnsi" w:cstheme="majorBidi"/>
+          <w:color w:val="0F4761" w:themeColor="accent1" w:themeShade="BF"/>
+          <w:sz w:val="32"/>
+          <w:szCs w:val="32"/>
+        </w:rPr>
+      </w:pPr>
+      <w:r>
+        <w:rPr>
+          <w:rFonts w:asciiTheme="majorHAnsi" w:eastAsiaTheme="majorEastAsia" w:hAnsiTheme="majorHAnsi" w:cstheme="majorBidi"/>
+          <w:color w:val="0F4761" w:themeColor="accent1" w:themeShade="BF"/>
+          <w:sz w:val="32"/>
+          <w:szCs w:val="32"/>
+        </w:rPr>
+        <w:br w:type="page"/>
       </w:r>
     </w:p>
     <w:p>
@@ -570,30 +584,22 @@
         <w:pBdr>
           <w:bottom w:val="single" w:sz="6" w:space="1" w:color="000000"/>
         </w:pBdr>
-      </w:pPr>
-      <w:r>
-        <w:t>Prerequisites</w:t>
-      </w:r>
-      <w:r>
-        <w:t>:</w:t>
-      </w:r>
-      <w:r>
-        <w:t xml:space="preserve"> </w:t>
-      </w:r>
-      <w:r>
-        <w:t>I</w:t>
-      </w:r>
-      <w:r>
-        <w:t xml:space="preserve">nstall </w:t>
-      </w:r>
-      <w:r>
-        <w:t>Python 3.11</w:t>
-      </w:r>
-      <w:r>
-        <w:t>. Then, install AstroPy and Flask packages.</w:t>
-      </w:r>
-      <w:r>
-        <w:t xml:space="preserve"> This can be done with the pip utils:</w:t>
+        <w:rPr>
+          <w:rFonts w:asciiTheme="majorHAnsi" w:eastAsiaTheme="majorEastAsia" w:hAnsiTheme="majorHAnsi" w:cstheme="majorBidi"/>
+          <w:color w:val="0F4761" w:themeColor="accent1" w:themeShade="BF"/>
+          <w:sz w:val="32"/>
+          <w:szCs w:val="32"/>
+        </w:rPr>
+      </w:pPr>
+      <w:r>
+        <w:rPr>
+          <w:rFonts w:asciiTheme="majorHAnsi" w:eastAsiaTheme="majorEastAsia" w:hAnsiTheme="majorHAnsi" w:cstheme="majorBidi"/>
+          <w:color w:val="0F4761" w:themeColor="accent1" w:themeShade="BF"/>
+          <w:sz w:val="32"/>
+          <w:szCs w:val="32"/>
+        </w:rPr>
+        <w:lastRenderedPageBreak/>
+        <w:t>Appendix. Installing the Local Microservice</w:t>
       </w:r>
     </w:p>
     <w:p>
@@ -603,7 +609,36 @@
         </w:pBdr>
       </w:pPr>
       <w:r>
-        <w:t>&gt;pip install astropy</w:t>
+        <w:t>Prerequisites</w:t>
+      </w:r>
+      <w:r>
+        <w:t>:</w:t>
+      </w:r>
+      <w:r>
+        <w:t xml:space="preserve"> </w:t>
+      </w:r>
+      <w:r>
+        <w:t>I</w:t>
+      </w:r>
+      <w:r>
+        <w:t>nstall Python 3.11</w:t>
+      </w:r>
+      <w:r>
+        <w:t xml:space="preserve"> or higher</w:t>
+      </w:r>
+      <w:r>
+        <w:t xml:space="preserve">. Then, install </w:t>
+      </w:r>
+      <w:proofErr w:type="spellStart"/>
+      <w:r>
+        <w:t>AstroPy</w:t>
+      </w:r>
+      <w:proofErr w:type="spellEnd"/>
+      <w:r>
+        <w:t xml:space="preserve"> and Flask packages.</w:t>
+      </w:r>
+      <w:r>
+        <w:t xml:space="preserve"> This can be done with the pip utils:</w:t>
       </w:r>
     </w:p>
     <w:p>
@@ -613,8 +648,13 @@
         </w:pBdr>
       </w:pPr>
       <w:r>
-        <w:t>&gt;pip install flask</w:t>
-      </w:r>
+        <w:t xml:space="preserve">&gt;pip install </w:t>
+      </w:r>
+      <w:proofErr w:type="spellStart"/>
+      <w:r>
+        <w:t>astropy</w:t>
+      </w:r>
+      <w:proofErr w:type="spellEnd"/>
     </w:p>
     <w:p>
       <w:pPr>
@@ -623,40 +663,7 @@
         </w:pBdr>
       </w:pPr>
       <w:r>
-        <w:t>The</w:t>
-      </w:r>
-      <w:r>
-        <w:t xml:space="preserve"> Python microservice ‘</w:t>
-      </w:r>
-      <w:r>
-        <w:t>astro_time_convert.py</w:t>
-      </w:r>
-      <w:r>
-        <w:t>’ is</w:t>
-      </w:r>
-      <w:r>
-        <w:t xml:space="preserve"> located</w:t>
-      </w:r>
-      <w:r>
-        <w:t xml:space="preserve"> </w:t>
-      </w:r>
-      <w:r>
-        <w:t>in the ‘</w:t>
-      </w:r>
-      <w:r>
-        <w:t>PyMicroService</w:t>
-      </w:r>
-      <w:r>
-        <w:t xml:space="preserve">’ subfolder </w:t>
-      </w:r>
-      <w:r>
-        <w:t>with</w:t>
-      </w:r>
-      <w:r>
-        <w:t>in the ‘vstar’ folder.</w:t>
-      </w:r>
-      <w:r>
-        <w:t xml:space="preserve"> Run it with the command:</w:t>
+        <w:t>&gt;pip install flask</w:t>
       </w:r>
     </w:p>
     <w:p>
@@ -666,7 +673,52 @@
         </w:pBdr>
       </w:pPr>
       <w:r>
-        <w:t>&gt;python astro_time_convert.py</w:t>
+        <w:t>The</w:t>
+      </w:r>
+      <w:r>
+        <w:t xml:space="preserve"> Python microservice ‘astro_time_convert.py’ </w:t>
+      </w:r>
+      <w:proofErr w:type="gramStart"/>
+      <w:r>
+        <w:t>is</w:t>
+      </w:r>
+      <w:r>
+        <w:t xml:space="preserve"> located</w:t>
+      </w:r>
+      <w:r>
+        <w:t xml:space="preserve"> </w:t>
+      </w:r>
+      <w:r>
+        <w:t>in</w:t>
+      </w:r>
+      <w:proofErr w:type="gramEnd"/>
+      <w:r>
+        <w:t xml:space="preserve"> the ‘</w:t>
+      </w:r>
+      <w:proofErr w:type="spellStart"/>
+      <w:r>
+        <w:t>PyMicroService</w:t>
+      </w:r>
+      <w:proofErr w:type="spellEnd"/>
+      <w:r>
+        <w:t xml:space="preserve">’ subfolder </w:t>
+      </w:r>
+      <w:r>
+        <w:t>with</w:t>
+      </w:r>
+      <w:r>
+        <w:t>in the ‘</w:t>
+      </w:r>
+      <w:proofErr w:type="spellStart"/>
+      <w:r>
+        <w:t>vstar</w:t>
+      </w:r>
+      <w:proofErr w:type="spellEnd"/>
+      <w:r>
+        <w:t>’ folder.</w:t>
+      </w:r>
+      <w:r>
+        <w:t xml:space="preserve"> Run it with the command:</w:t>
       </w:r>
     </w:p>
     <w:p>
@@ -676,10 +728,17 @@
         </w:pBdr>
       </w:pPr>
       <w:r>
-        <w:t>Once the microservice launches successfully, you should see something like the following</w:t>
-      </w:r>
-      <w:r>
-        <w:t>:</w:t>
+        <w:t>&gt;python astro_time_convert.py</w:t>
+      </w:r>
+    </w:p>
+    <w:p>
+      <w:pPr>
+        <w:pBdr>
+          <w:bottom w:val="single" w:sz="6" w:space="1" w:color="000000"/>
+        </w:pBdr>
+      </w:pPr>
+      <w:r>
+        <w:t>Once the microservice launches successfully, you should see something like the following:</w:t>
       </w:r>
     </w:p>
     <w:p>
@@ -693,7 +752,6 @@
         <w:rPr>
           <w:noProof/>
         </w:rPr>
-        <w:lastRenderedPageBreak/>
         <w:drawing>
           <wp:inline distT="0" distB="0" distL="0" distR="0" wp14:anchorId="29A3870D" wp14:editId="45A2F284">
             <wp:extent cx="5943600" cy="2027555"/>
@@ -712,7 +770,7 @@
                     </pic:cNvPicPr>
                   </pic:nvPicPr>
                   <pic:blipFill>
-                    <a:blip r:embed="rId13">
+                    <a:blip r:embed="rId12">
                       <a:extLst>
                         <a:ext uri="{28A0092B-C50C-407E-A947-70E740481C1C}">
                           <a14:useLocalDpi xmlns:a14="http://schemas.microsoft.com/office/drawing/2010/main" val="0"/>
@@ -751,7 +809,15 @@
         </w:pBdr>
       </w:pPr>
       <w:r>
-        <w:t>You may ignore the warning; it simply means that you are running a single-threaded internal Flask web server, which is perfectly sufficient for our needs.</w:t>
+        <w:t>You may ignore the warning; it simply means that you are running a single-</w:t>
+      </w:r>
+      <w:proofErr w:type="gramStart"/>
+      <w:r>
+        <w:t>threaded</w:t>
+      </w:r>
+      <w:proofErr w:type="gramEnd"/>
+      <w:r>
+        <w:t xml:space="preserve"> internal Flask web server, which is perfectly sufficient for our needs.</w:t>
       </w:r>
     </w:p>
     <w:p>
@@ -761,195 +827,15 @@
         </w:pBdr>
       </w:pPr>
       <w:r>
-        <w:t>In your home directory</w:t>
-      </w:r>
-      <w:r>
-        <w:rPr>
-          <w:rStyle w:val="af"/>
-        </w:rPr>
-        <w:footnoteReference w:id="2"/>
-      </w:r>
-      <w:r>
-        <w:t xml:space="preserve">, </w:t>
-      </w:r>
-      <w:r>
-        <w:t>locate</w:t>
-      </w:r>
-      <w:r>
-        <w:t xml:space="preserve"> the </w:t>
-      </w:r>
-      <w:r>
-        <w:t>‘</w:t>
-      </w:r>
-      <w:r>
-        <w:t>.vstar</w:t>
-      </w:r>
-      <w:r>
-        <w:t>’</w:t>
-      </w:r>
-      <w:r>
-        <w:t xml:space="preserve"> folder.</w:t>
-      </w:r>
-      <w:r>
-        <w:t xml:space="preserve"> </w:t>
-      </w:r>
-      <w:r>
-        <w:t>It should contain</w:t>
-      </w:r>
-      <w:r>
-        <w:t xml:space="preserve"> a ‘</w:t>
-      </w:r>
-      <w:r>
-        <w:t>vstar.properties</w:t>
-      </w:r>
-      <w:r>
-        <w:t>’ file.</w:t>
-      </w:r>
-      <w:r>
-        <w:t xml:space="preserve"> </w:t>
-      </w:r>
-      <w:r>
-        <w:t>In Windows, t</w:t>
-      </w:r>
-      <w:r>
-        <w:t xml:space="preserve">his folder and file should be created </w:t>
-      </w:r>
-      <w:r>
-        <w:t xml:space="preserve">by the installer. </w:t>
-      </w:r>
-      <w:r>
-        <w:t xml:space="preserve">If there is no </w:t>
-      </w:r>
-      <w:r>
-        <w:t>such</w:t>
-      </w:r>
-      <w:r>
-        <w:t xml:space="preserve"> folder, create it</w:t>
-      </w:r>
-      <w:r>
-        <w:t xml:space="preserve">. </w:t>
-      </w:r>
-      <w:r>
-        <w:t>Then try to locate the</w:t>
-      </w:r>
-      <w:r>
-        <w:t xml:space="preserve"> </w:t>
-      </w:r>
-      <w:r>
-        <w:t>‘</w:t>
-      </w:r>
-      <w:r>
-        <w:t>vstar.properties</w:t>
-      </w:r>
-      <w:r>
-        <w:t>’</w:t>
-      </w:r>
-      <w:r>
-        <w:t xml:space="preserve"> </w:t>
-      </w:r>
-      <w:r>
-        <w:t xml:space="preserve">file </w:t>
-      </w:r>
-      <w:r>
-        <w:t>in the VStar installation folder and copy it to the ‘.vstar’ folder.</w:t>
-      </w:r>
-      <w:r>
-        <w:t xml:space="preserve"> </w:t>
-      </w:r>
-      <w:r>
-        <w:t xml:space="preserve">Open .vstar/vstar.properties in a text editor and set the value of the </w:t>
-      </w:r>
-      <w:r>
-        <w:t>‘</w:t>
-      </w:r>
-      <w:r>
-        <w:t>localJDconverter.active</w:t>
-      </w:r>
-      <w:r>
-        <w:t>’</w:t>
-      </w:r>
-      <w:r>
-        <w:t xml:space="preserve"> parameter to </w:t>
-      </w:r>
-      <w:r>
-        <w:t>‘</w:t>
-      </w:r>
-      <w:r>
-        <w:t>y</w:t>
-      </w:r>
-      <w:r>
-        <w:t>’:</w:t>
-      </w:r>
-    </w:p>
-    <w:p>
-      <w:pPr>
-        <w:pBdr>
-          <w:bottom w:val="single" w:sz="6" w:space="1" w:color="000000"/>
-        </w:pBdr>
-        <w:jc w:val="center"/>
-      </w:pPr>
-      <w:r>
-        <w:rPr>
-          <w:noProof/>
-        </w:rPr>
-        <w:drawing>
-          <wp:inline distT="0" distB="0" distL="0" distR="0" wp14:anchorId="09F4F877" wp14:editId="790E05A5">
-            <wp:extent cx="5296535" cy="1202055"/>
-            <wp:effectExtent l="0" t="0" r="0" b="0"/>
-            <wp:docPr id="66075758" name="Рисунок 2" descr="Зображення, що містить текст, знімок екрана, Шрифт&#10;&#10;Вміст на основі ШІ може бути неправильним."/>
-            <wp:cNvGraphicFramePr>
-              <a:graphicFrameLocks xmlns:a="http://schemas.openxmlformats.org/drawingml/2006/main" noChangeAspect="1"/>
-            </wp:cNvGraphicFramePr>
-            <a:graphic xmlns:a="http://schemas.openxmlformats.org/drawingml/2006/main">
-              <a:graphicData uri="http://schemas.openxmlformats.org/drawingml/2006/picture">
-                <pic:pic xmlns:pic="http://schemas.openxmlformats.org/drawingml/2006/picture">
-                  <pic:nvPicPr>
-                    <pic:cNvPr id="66075758" name="Рисунок 2" descr="Зображення, що містить текст, знімок екрана, Шрифт&#10;&#10;Вміст на основі ШІ може бути неправильним."/>
-                    <pic:cNvPicPr>
-                      <a:picLocks noChangeAspect="1" noChangeArrowheads="1"/>
-                    </pic:cNvPicPr>
-                  </pic:nvPicPr>
-                  <pic:blipFill>
-                    <a:blip r:embed="rId14">
-                      <a:extLst>
-                        <a:ext uri="{28A0092B-C50C-407E-A947-70E740481C1C}">
-                          <a14:useLocalDpi xmlns:a14="http://schemas.microsoft.com/office/drawing/2010/main" val="0"/>
-                        </a:ext>
-                      </a:extLst>
-                    </a:blip>
-                    <a:srcRect/>
-                    <a:stretch>
-                      <a:fillRect/>
-                    </a:stretch>
-                  </pic:blipFill>
-                  <pic:spPr bwMode="auto">
-                    <a:xfrm>
-                      <a:off x="0" y="0"/>
-                      <a:ext cx="5296535" cy="1202055"/>
-                    </a:xfrm>
-                    <a:prstGeom prst="rect">
-                      <a:avLst/>
-                    </a:prstGeom>
-                    <a:noFill/>
-                    <a:ln>
-                      <a:noFill/>
-                    </a:ln>
-                  </pic:spPr>
-                </pic:pic>
-              </a:graphicData>
-            </a:graphic>
-          </wp:inline>
-        </w:drawing>
-      </w:r>
-    </w:p>
-    <w:p>
-      <w:pPr>
-        <w:pBdr>
-          <w:bottom w:val="single" w:sz="6" w:space="1" w:color="000000"/>
-        </w:pBdr>
-      </w:pPr>
-      <w:r>
-        <w:t>To test the microservice, run VStar, load some data (for example, V405 Dra, all times, Johnson V). Invoke the [Tools] -&gt; [BJD_TDB Converter] command and press OK.</w:t>
+        <w:t xml:space="preserve">To test the microservice, run </w:t>
+      </w:r>
+      <w:proofErr w:type="spellStart"/>
+      <w:r>
+        <w:t>VStar</w:t>
+      </w:r>
+      <w:proofErr w:type="spellEnd"/>
+      <w:r>
+        <w:t>, load some data (for example, V405 Dra, all times, Johnson V). Invoke the [Tools] -&gt; [BJD_TDB Converter] command and press OK.</w:t>
       </w:r>
     </w:p>
     <w:p>
@@ -982,7 +868,7 @@
                     </pic:cNvPicPr>
                   </pic:nvPicPr>
                   <pic:blipFill>
-                    <a:blip r:embed="rId15">
+                    <a:blip r:embed="rId13">
                       <a:extLst>
                         <a:ext uri="{28A0092B-C50C-407E-A947-70E740481C1C}">
                           <a14:useLocalDpi xmlns:a14="http://schemas.microsoft.com/office/drawing/2010/main" val="0"/>
@@ -1045,7 +931,7 @@
                     </pic:cNvPicPr>
                   </pic:nvPicPr>
                   <pic:blipFill>
-                    <a:blip r:embed="rId16">
+                    <a:blip r:embed="rId14">
                       <a:extLst>
                         <a:ext uri="{28A0092B-C50C-407E-A947-70E740481C1C}">
                           <a14:useLocalDpi xmlns:a14="http://schemas.microsoft.com/office/drawing/2010/main" val="0"/>
@@ -1079,21 +965,6 @@
     </w:p>
     <w:p>
       <w:r>
-        <w:t xml:space="preserve">You can try deactivating the local service (via </w:t>
-      </w:r>
-      <w:r>
-        <w:t>‘</w:t>
-      </w:r>
-      <w:r>
-        <w:t>vstar.properties</w:t>
-      </w:r>
-      <w:r>
-        <w:t>’</w:t>
-      </w:r>
-      <w:r>
-        <w:t>), restarting VStar, and attempting the conversion again (the Ohio State University service will be used).</w:t>
-      </w:r>
-      <w:r>
         <w:br w:type="page"/>
       </w:r>
     </w:p>
@@ -1105,9 +976,30 @@
     </w:p>
     <w:p>
       <w:r>
+        <w:t xml:space="preserve">Rev </w:t>
+      </w:r>
+      <w:r>
+        <w:t>B</w:t>
+      </w:r>
+      <w:r>
+        <w:t>, 202</w:t>
+      </w:r>
+      <w:r>
+        <w:t>6</w:t>
+      </w:r>
+      <w:r>
+        <w:t>-06-</w:t>
+      </w:r>
+      <w:r>
+        <w:t>07</w:t>
+      </w:r>
+    </w:p>
+    <w:p>
+      <w:r>
         <w:t>Rev A, 2025-06-19</w:t>
       </w:r>
     </w:p>
+    <w:p/>
     <w:p/>
     <w:sectPr>
       <w:pgSz w:w="12240" w:h="15840"/>
@@ -1206,82 +1098,6 @@
           <w:t>https://ui.adsabs.harvard.edu/abs/2010PASP..122..935E/abstract</w:t>
         </w:r>
       </w:hyperlink>
-    </w:p>
-  </w:footnote>
-  <w:footnote w:id="2">
-    <w:p>
-      <w:pPr>
-        <w:pStyle w:val="ad"/>
-      </w:pPr>
-      <w:r>
-        <w:rPr>
-          <w:rStyle w:val="af"/>
-        </w:rPr>
-        <w:footnoteRef/>
-      </w:r>
-      <w:r>
-        <w:t xml:space="preserve"> </w:t>
-      </w:r>
-      <w:r>
-        <w:t>In</w:t>
-      </w:r>
-      <w:r>
-        <w:t xml:space="preserve"> Windows</w:t>
-      </w:r>
-      <w:r>
-        <w:t>,</w:t>
-      </w:r>
-      <w:r>
-        <w:t xml:space="preserve"> this is </w:t>
-      </w:r>
-      <w:r>
-        <w:t xml:space="preserve">typically </w:t>
-      </w:r>
-      <w:r>
-        <w:t>C:\Users\</w:t>
-      </w:r>
-      <w:r>
-        <w:t>&lt;</w:t>
-      </w:r>
-      <w:r>
-        <w:t>username</w:t>
-      </w:r>
-      <w:r>
-        <w:t xml:space="preserve">&gt;; </w:t>
-      </w:r>
-      <w:r>
-        <w:t>in</w:t>
-      </w:r>
-      <w:r>
-        <w:t xml:space="preserve"> Linux</w:t>
-      </w:r>
-      <w:r>
-        <w:t>,</w:t>
-      </w:r>
-      <w:r>
-        <w:t xml:space="preserve"> </w:t>
-      </w:r>
-      <w:r>
-        <w:t>it</w:t>
-      </w:r>
-      <w:r>
-        <w:t xml:space="preserve"> is </w:t>
-      </w:r>
-      <w:r>
-        <w:t>usually</w:t>
-      </w:r>
-      <w:r>
-        <w:t xml:space="preserve"> /home/</w:t>
-      </w:r>
-      <w:r>
-        <w:t>&lt;</w:t>
-      </w:r>
-      <w:r>
-        <w:t>username</w:t>
-      </w:r>
-      <w:r>
-        <w:t>&gt;</w:t>
-      </w:r>
     </w:p>
   </w:footnote>
 </w:footnotes>

</xml_diff>